<commit_message>
fix(resume): align masthead and summary with the site's Platform & DevOps Architect headline
The hosted resume still led with 'Staff DevOps and Platform Engineering
Leader' while every page of the site said 'Platform & DevOps Architect' —
the exact contradiction the rest of this work removed.

Co-Authored-By: Claude Opus 5 <noreply@anthropic.com>
</commit_message>
<xml_diff>
--- a/assets/resume/Sudhakar_Chundu_Master_Resume.docx
+++ b/assets/resume/Sudhakar_Chundu_Master_Resume.docx
@@ -34,7 +34,7 @@
           <w:sz w:val="22"/>
           <w:szCs w:val="22"/>
         </w:rPr>
-        <w:t xml:space="preserve">Staff DevOps and Platform Engineering Leader</w:t>
+        <w:t xml:space="preserve">Platform and DevOps Architect</w:t>
       </w:r>
     </w:p>
     <w:p>
@@ -143,7 +143,7 @@
           <w:sz w:val="20"/>
           <w:szCs w:val="20"/>
         </w:rPr>
-        <w:t xml:space="preserve">Staff DevOps and Platform Engineering Leader with 18 plus years across platform engineering, site reliability (SRE), DevOps and security, starting with Linux and middleware administration in 2007. Optimizes software delivery across cloud and on-premises environments: CI/CD pipeline automation (Azure DevOps, GitHub Actions, Jenkins, ArgoCD), infrastructure as code (Terraform, ARM/Bicep, Helm, Kubernetes, Docker), and golden path templates that make delivery repeatable, secure and low-effort. Built internal platforms serving 50 plus engineers that removed bottlenecks and reached 99.97 percent deployment reliability, cut infrastructure cost 73 percent and reduced deployment time from days to 15 minutes. Currently owns the shared delivery platform for an enterprise Azure data and AI estate - ADLS Gen2 with Private Endpoints, Databricks, Delta Lake and Unity Catalog across a multi-subscription environment - with Terraform IaC, GitOps and CI/CD automation. Has led teams of up to 14 engineers across 15 plus years of technical leadership.</w:t>
+        <w:t xml:space="preserve">Platform and DevOps Architect with 18 plus years across platform engineering, site reliability (SRE), DevOps and security, starting with Linux and middleware administration in 2007. Optimizes software delivery across cloud and on-premises environments: CI/CD pipeline automation (Azure DevOps, GitHub Actions, Jenkins, ArgoCD), infrastructure as code (Terraform, ARM/Bicep, Helm, Kubernetes, Docker), and golden path templates that make delivery repeatable, secure and low-effort. Built internal platforms serving 50 plus engineers that removed bottlenecks and reached 99.97 percent deployment reliability, cut infrastructure cost 73 percent and reduced deployment time from days to 15 minutes. Currently owns the shared delivery platform for an enterprise Azure data and AI estate - ADLS Gen2 with Private Endpoints, Databricks, Delta Lake and Unity Catalog across a multi-subscription environment - with Terraform IaC, GitOps and CI/CD automation. Has led teams of up to 14 engineers across 15 plus years of technical leadership.</w:t>
       </w:r>
     </w:p>
     <w:p>

</xml_diff>